<commit_message>
feat: New changes added to the word documents
</commit_message>
<xml_diff>
--- a/Data Base Systems/CourseWork Part A/w2151939_Part_A.docx
+++ b/Data Base Systems/CourseWork Part A/w2151939_Part_A.docx
@@ -4,17 +4,495 @@
   <w:body>
     <w:p>
       <w:r>
-        <w:t xml:space="preserve">W2151939 Part A </w:t>
+        <w:t>W2151939 Part A Course</w:t>
       </w:r>
-      <w:proofErr w:type="spellStart"/>
       <w:r>
-        <w:t>CourseWork</w:t>
+        <w:t>w</w:t>
       </w:r>
-      <w:proofErr w:type="spellEnd"/>
       <w:r>
-        <w:t xml:space="preserve">, tables </w:t>
+        <w:t>ork</w:t>
       </w:r>
     </w:p>
+    <w:p>
+      <w:r>
+        <w:t xml:space="preserve">Deliverable For Question 1  </w:t>
+      </w:r>
+    </w:p>
+    <w:p>
+      <w:pPr>
+        <w:pStyle w:val="ListParagraph"/>
+        <w:numPr>
+          <w:ilvl w:val="0"/>
+          <w:numId w:val="1"/>
+        </w:numPr>
+      </w:pPr>
+      <w:r>
+        <w:t xml:space="preserve">Table with 2 conceptual modelling conventions and 3 semantics </w:t>
+      </w:r>
+    </w:p>
+    <w:p/>
+    <w:p>
+      <w:r>
+        <w:t xml:space="preserve">Deliverable For Question 2 </w:t>
+      </w:r>
+    </w:p>
+    <w:p>
+      <w:pPr>
+        <w:pStyle w:val="ListParagraph"/>
+        <w:numPr>
+          <w:ilvl w:val="0"/>
+          <w:numId w:val="1"/>
+        </w:numPr>
+      </w:pPr>
+      <w:r>
+        <w:t xml:space="preserve">Conceptual EERD </w:t>
+      </w:r>
+    </w:p>
+    <w:p>
+      <w:pPr>
+        <w:pStyle w:val="ListParagraph"/>
+        <w:numPr>
+          <w:ilvl w:val="0"/>
+          <w:numId w:val="1"/>
+        </w:numPr>
+      </w:pPr>
+      <w:r>
+        <w:t xml:space="preserve">Simplified data dictionary (assessed under Clarity, notation and documentation). </w:t>
+      </w:r>
+    </w:p>
+    <w:p>
+      <w:pPr>
+        <w:pStyle w:val="ListParagraph"/>
+        <w:numPr>
+          <w:ilvl w:val="0"/>
+          <w:numId w:val="1"/>
+        </w:numPr>
+      </w:pPr>
+      <w:r>
+        <w:t xml:space="preserve">Table 1 Entities and specialisations </w:t>
+      </w:r>
+    </w:p>
+    <w:p>
+      <w:pPr>
+        <w:pStyle w:val="ListParagraph"/>
+        <w:numPr>
+          <w:ilvl w:val="0"/>
+          <w:numId w:val="1"/>
+        </w:numPr>
+      </w:pPr>
+      <w:r>
+        <w:t xml:space="preserve">Table 2 Relationships and multiplicities </w:t>
+      </w:r>
+    </w:p>
+    <w:p/>
+    <w:tbl>
+      <w:tblPr>
+        <w:tblStyle w:val="TableGrid"/>
+        <w:tblW w:w="9121" w:type="dxa"/>
+        <w:tblLook w:val="04A0" w:firstRow="1" w:lastRow="0" w:firstColumn="1" w:lastColumn="0" w:noHBand="0" w:noVBand="1"/>
+      </w:tblPr>
+      <w:tblGrid>
+        <w:gridCol w:w="1824"/>
+        <w:gridCol w:w="1824"/>
+        <w:gridCol w:w="1824"/>
+        <w:gridCol w:w="1824"/>
+        <w:gridCol w:w="1825"/>
+      </w:tblGrid>
+      <w:tr>
+        <w:trPr>
+          <w:trHeight w:val="1319"/>
+        </w:trPr>
+        <w:tc>
+          <w:tcPr>
+            <w:tcW w:w="1824" w:type="dxa"/>
+          </w:tcPr>
+          <w:p>
+            <w:pPr>
+              <w:rPr>
+                <w:b/>
+                <w:bCs/>
+                <w:sz w:val="18"/>
+                <w:szCs w:val="18"/>
+              </w:rPr>
+            </w:pPr>
+            <w:r>
+              <w:rPr>
+                <w:b/>
+                <w:bCs/>
+                <w:sz w:val="18"/>
+                <w:szCs w:val="18"/>
+              </w:rPr>
+              <w:t>#</w:t>
+            </w:r>
+          </w:p>
+        </w:tc>
+        <w:tc>
+          <w:tcPr>
+            <w:tcW w:w="1824" w:type="dxa"/>
+          </w:tcPr>
+          <w:p>
+            <w:pPr>
+              <w:rPr>
+                <w:b/>
+                <w:bCs/>
+                <w:sz w:val="18"/>
+                <w:szCs w:val="18"/>
+              </w:rPr>
+            </w:pPr>
+            <w:r>
+              <w:rPr>
+                <w:b/>
+                <w:bCs/>
+                <w:sz w:val="18"/>
+                <w:szCs w:val="18"/>
+              </w:rPr>
+              <w:t>Type</w:t>
+            </w:r>
+          </w:p>
+        </w:tc>
+        <w:tc>
+          <w:tcPr>
+            <w:tcW w:w="1824" w:type="dxa"/>
+          </w:tcPr>
+          <w:p>
+            <w:pPr>
+              <w:rPr>
+                <w:b/>
+                <w:bCs/>
+                <w:sz w:val="18"/>
+                <w:szCs w:val="18"/>
+              </w:rPr>
+            </w:pPr>
+            <w:r>
+              <w:rPr>
+                <w:b/>
+                <w:bCs/>
+                <w:sz w:val="18"/>
+                <w:szCs w:val="18"/>
+              </w:rPr>
+              <w:t xml:space="preserve">Weakness: What AI-generated EERD shows </w:t>
+            </w:r>
+          </w:p>
+        </w:tc>
+        <w:tc>
+          <w:tcPr>
+            <w:tcW w:w="1824" w:type="dxa"/>
+          </w:tcPr>
+          <w:p>
+            <w:pPr>
+              <w:rPr>
+                <w:b/>
+                <w:bCs/>
+                <w:sz w:val="18"/>
+                <w:szCs w:val="18"/>
+              </w:rPr>
+            </w:pPr>
+            <w:r>
+              <w:rPr>
+                <w:b/>
+                <w:bCs/>
+                <w:sz w:val="18"/>
+                <w:szCs w:val="18"/>
+              </w:rPr>
+              <w:t xml:space="preserve">Evidence: the modelling convention (weaknesses 1-2) or a reference to a specific component of the </w:t>
+            </w:r>
+            <w:proofErr w:type="spellStart"/>
+            <w:r>
+              <w:rPr>
+                <w:b/>
+                <w:bCs/>
+                <w:sz w:val="18"/>
+                <w:szCs w:val="18"/>
+              </w:rPr>
+              <w:t>Westlivingster</w:t>
+            </w:r>
+            <w:proofErr w:type="spellEnd"/>
+            <w:r>
+              <w:rPr>
+                <w:b/>
+                <w:bCs/>
+                <w:sz w:val="18"/>
+                <w:szCs w:val="18"/>
+              </w:rPr>
+              <w:t xml:space="preserve"> brief (weaknesses 3-5)</w:t>
+            </w:r>
+          </w:p>
+        </w:tc>
+        <w:tc>
+          <w:tcPr>
+            <w:tcW w:w="1825" w:type="dxa"/>
+          </w:tcPr>
+          <w:p>
+            <w:pPr>
+              <w:rPr>
+                <w:b/>
+                <w:bCs/>
+                <w:sz w:val="18"/>
+                <w:szCs w:val="18"/>
+              </w:rPr>
+            </w:pPr>
+            <w:r>
+              <w:rPr>
+                <w:b/>
+                <w:bCs/>
+                <w:sz w:val="18"/>
+                <w:szCs w:val="18"/>
+              </w:rPr>
+              <w:t>Potential improvement: how the component could be better modelled</w:t>
+            </w:r>
+          </w:p>
+        </w:tc>
+      </w:tr>
+      <w:tr>
+        <w:trPr>
+          <w:trHeight w:val="1319"/>
+        </w:trPr>
+        <w:tc>
+          <w:tcPr>
+            <w:tcW w:w="1824" w:type="dxa"/>
+          </w:tcPr>
+          <w:p>
+            <w:pPr>
+              <w:rPr>
+                <w:b/>
+                <w:bCs/>
+              </w:rPr>
+            </w:pPr>
+            <w:r>
+              <w:rPr>
+                <w:b/>
+                <w:bCs/>
+              </w:rPr>
+              <w:t>1</w:t>
+            </w:r>
+          </w:p>
+        </w:tc>
+        <w:tc>
+          <w:tcPr>
+            <w:tcW w:w="1824" w:type="dxa"/>
+          </w:tcPr>
+          <w:p/>
+        </w:tc>
+        <w:tc>
+          <w:tcPr>
+            <w:tcW w:w="1824" w:type="dxa"/>
+          </w:tcPr>
+          <w:p/>
+        </w:tc>
+        <w:tc>
+          <w:tcPr>
+            <w:tcW w:w="1824" w:type="dxa"/>
+          </w:tcPr>
+          <w:p/>
+        </w:tc>
+        <w:tc>
+          <w:tcPr>
+            <w:tcW w:w="1825" w:type="dxa"/>
+          </w:tcPr>
+          <w:p/>
+        </w:tc>
+      </w:tr>
+      <w:tr>
+        <w:trPr>
+          <w:trHeight w:val="1369"/>
+        </w:trPr>
+        <w:tc>
+          <w:tcPr>
+            <w:tcW w:w="1824" w:type="dxa"/>
+          </w:tcPr>
+          <w:p>
+            <w:pPr>
+              <w:rPr>
+                <w:b/>
+                <w:bCs/>
+              </w:rPr>
+            </w:pPr>
+            <w:r>
+              <w:rPr>
+                <w:b/>
+                <w:bCs/>
+              </w:rPr>
+              <w:t>2</w:t>
+            </w:r>
+          </w:p>
+        </w:tc>
+        <w:tc>
+          <w:tcPr>
+            <w:tcW w:w="1824" w:type="dxa"/>
+          </w:tcPr>
+          <w:p/>
+        </w:tc>
+        <w:tc>
+          <w:tcPr>
+            <w:tcW w:w="1824" w:type="dxa"/>
+          </w:tcPr>
+          <w:p/>
+        </w:tc>
+        <w:tc>
+          <w:tcPr>
+            <w:tcW w:w="1824" w:type="dxa"/>
+          </w:tcPr>
+          <w:p/>
+        </w:tc>
+        <w:tc>
+          <w:tcPr>
+            <w:tcW w:w="1825" w:type="dxa"/>
+          </w:tcPr>
+          <w:p/>
+        </w:tc>
+      </w:tr>
+      <w:tr>
+        <w:trPr>
+          <w:trHeight w:val="1319"/>
+        </w:trPr>
+        <w:tc>
+          <w:tcPr>
+            <w:tcW w:w="1824" w:type="dxa"/>
+          </w:tcPr>
+          <w:p>
+            <w:pPr>
+              <w:rPr>
+                <w:b/>
+                <w:bCs/>
+              </w:rPr>
+            </w:pPr>
+            <w:r>
+              <w:rPr>
+                <w:b/>
+                <w:bCs/>
+              </w:rPr>
+              <w:t>3</w:t>
+            </w:r>
+          </w:p>
+        </w:tc>
+        <w:tc>
+          <w:tcPr>
+            <w:tcW w:w="1824" w:type="dxa"/>
+          </w:tcPr>
+          <w:p/>
+        </w:tc>
+        <w:tc>
+          <w:tcPr>
+            <w:tcW w:w="1824" w:type="dxa"/>
+          </w:tcPr>
+          <w:p/>
+        </w:tc>
+        <w:tc>
+          <w:tcPr>
+            <w:tcW w:w="1824" w:type="dxa"/>
+          </w:tcPr>
+          <w:p/>
+        </w:tc>
+        <w:tc>
+          <w:tcPr>
+            <w:tcW w:w="1825" w:type="dxa"/>
+          </w:tcPr>
+          <w:p/>
+        </w:tc>
+      </w:tr>
+      <w:tr>
+        <w:trPr>
+          <w:trHeight w:val="1319"/>
+        </w:trPr>
+        <w:tc>
+          <w:tcPr>
+            <w:tcW w:w="1824" w:type="dxa"/>
+          </w:tcPr>
+          <w:p>
+            <w:pPr>
+              <w:rPr>
+                <w:b/>
+                <w:bCs/>
+              </w:rPr>
+            </w:pPr>
+            <w:r>
+              <w:rPr>
+                <w:b/>
+                <w:bCs/>
+              </w:rPr>
+              <w:t>4</w:t>
+            </w:r>
+          </w:p>
+        </w:tc>
+        <w:tc>
+          <w:tcPr>
+            <w:tcW w:w="1824" w:type="dxa"/>
+          </w:tcPr>
+          <w:p/>
+        </w:tc>
+        <w:tc>
+          <w:tcPr>
+            <w:tcW w:w="1824" w:type="dxa"/>
+          </w:tcPr>
+          <w:p/>
+        </w:tc>
+        <w:tc>
+          <w:tcPr>
+            <w:tcW w:w="1824" w:type="dxa"/>
+          </w:tcPr>
+          <w:p/>
+        </w:tc>
+        <w:tc>
+          <w:tcPr>
+            <w:tcW w:w="1825" w:type="dxa"/>
+          </w:tcPr>
+          <w:p/>
+        </w:tc>
+      </w:tr>
+      <w:tr>
+        <w:trPr>
+          <w:trHeight w:val="1319"/>
+        </w:trPr>
+        <w:tc>
+          <w:tcPr>
+            <w:tcW w:w="1824" w:type="dxa"/>
+          </w:tcPr>
+          <w:p>
+            <w:pPr>
+              <w:rPr>
+                <w:b/>
+                <w:bCs/>
+              </w:rPr>
+            </w:pPr>
+            <w:r>
+              <w:rPr>
+                <w:b/>
+                <w:bCs/>
+              </w:rPr>
+              <w:t>5</w:t>
+            </w:r>
+          </w:p>
+        </w:tc>
+        <w:tc>
+          <w:tcPr>
+            <w:tcW w:w="1824" w:type="dxa"/>
+          </w:tcPr>
+          <w:p/>
+        </w:tc>
+        <w:tc>
+          <w:tcPr>
+            <w:tcW w:w="1824" w:type="dxa"/>
+          </w:tcPr>
+          <w:p/>
+        </w:tc>
+        <w:tc>
+          <w:tcPr>
+            <w:tcW w:w="1824" w:type="dxa"/>
+          </w:tcPr>
+          <w:p/>
+        </w:tc>
+        <w:tc>
+          <w:tcPr>
+            <w:tcW w:w="1825" w:type="dxa"/>
+          </w:tcPr>
+          <w:p/>
+        </w:tc>
+      </w:tr>
+    </w:tbl>
+    <w:p/>
+    <w:p/>
+    <w:p/>
+    <w:p/>
     <w:p/>
     <w:p/>
     <w:p/>
@@ -26,6 +504,126 @@
     </w:sectPr>
   </w:body>
 </w:document>
+</file>
+
+<file path=word/numbering.xml><?xml version="1.0" encoding="utf-8"?>
+<w:numbering xmlns:wpc="http://schemas.microsoft.com/office/word/2010/wordprocessingCanvas" xmlns:cx="http://schemas.microsoft.com/office/drawing/2014/chartex" xmlns:cx1="http://schemas.microsoft.com/office/drawing/2015/9/8/chartex" xmlns:cx2="http://schemas.microsoft.com/office/drawing/2015/10/21/chartex" xmlns:cx3="http://schemas.microsoft.com/office/drawing/2016/5/9/chartex" xmlns:cx4="http://schemas.microsoft.com/office/drawing/2016/5/10/chartex" xmlns:cx5="http://schemas.microsoft.com/office/drawing/2016/5/11/chartex" xmlns:cx6="http://schemas.microsoft.com/office/drawing/2016/5/12/chartex" xmlns:cx7="http://schemas.microsoft.com/office/drawing/2016/5/13/chartex" xmlns:cx8="http://schemas.microsoft.com/office/drawing/2016/5/14/chartex" xmlns:mc="http://schemas.openxmlformats.org/markup-compatibility/2006" xmlns:aink="http://schemas.microsoft.com/office/drawing/2016/ink" xmlns:am3d="http://schemas.microsoft.com/office/drawing/2017/model3d" xmlns:o="urn:schemas-microsoft-com:office:office" xmlns:oel="http://schemas.microsoft.com/office/2019/extlst" xmlns:r="http://schemas.openxmlformats.org/officeDocument/2006/relationships" xmlns:m="http://schemas.openxmlformats.org/officeDocument/2006/math" xmlns:v="urn:schemas-microsoft-com:vml" xmlns:wp14="http://schemas.microsoft.com/office/word/2010/wordprocessingDrawing" xmlns:wp="http://schemas.openxmlformats.org/drawingml/2006/wordprocessingDrawing" xmlns:w10="urn:schemas-microsoft-com:office:word" xmlns:w="http://schemas.openxmlformats.org/wordprocessingml/2006/main" xmlns:w14="http://schemas.microsoft.com/office/word/2010/wordml" xmlns:w15="http://schemas.microsoft.com/office/word/2012/wordml" xmlns:w16cex="http://schemas.microsoft.com/office/word/2018/wordml/cex" xmlns:w16cid="http://schemas.microsoft.com/office/word/2016/wordml/cid" xmlns:w16="http://schemas.microsoft.com/office/word/2018/wordml" xmlns:w16du="http://schemas.microsoft.com/office/word/2023/wordml/word16du" xmlns:w16sdtdh="http://schemas.microsoft.com/office/word/2020/wordml/sdtdatahash" xmlns:w16sdtfl="http://schemas.microsoft.com/office/word/2024/wordml/sdtformatlock" xmlns:w16se="http://schemas.microsoft.com/office/word/2015/wordml/symex" xmlns:wpg="http://schemas.microsoft.com/office/word/2010/wordprocessingGroup" xmlns:wpi="http://schemas.microsoft.com/office/word/2010/wordprocessingInk" xmlns:wne="http://schemas.microsoft.com/office/word/2006/wordml" xmlns:wps="http://schemas.microsoft.com/office/word/2010/wordprocessingShape" mc:Ignorable="w14 w15 w16se w16cid w16 w16cex w16sdtdh w16sdtfl w16du wp14">
+  <w:abstractNum w:abstractNumId="0" w15:restartNumberingAfterBreak="0">
+    <w:nsid w:val="57BA5559"/>
+    <w:multiLevelType w:val="hybridMultilevel"/>
+    <w:tmpl w:val="009EE508"/>
+    <w:lvl w:ilvl="0" w:tplc="F4645324">
+      <w:numFmt w:val="bullet"/>
+      <w:lvlText w:val="-"/>
+      <w:lvlJc w:val="left"/>
+      <w:pPr>
+        <w:ind w:left="1080" w:hanging="360"/>
+      </w:pPr>
+      <w:rPr>
+        <w:rFonts w:ascii="Aptos" w:eastAsiaTheme="minorHAnsi" w:hAnsi="Aptos" w:cstheme="minorBidi" w:hint="default"/>
+      </w:rPr>
+    </w:lvl>
+    <w:lvl w:ilvl="1" w:tplc="08090003" w:tentative="1">
+      <w:start w:val="1"/>
+      <w:numFmt w:val="bullet"/>
+      <w:lvlText w:val="o"/>
+      <w:lvlJc w:val="left"/>
+      <w:pPr>
+        <w:ind w:left="1800" w:hanging="360"/>
+      </w:pPr>
+      <w:rPr>
+        <w:rFonts w:ascii="Courier New" w:hAnsi="Courier New" w:cs="Courier New" w:hint="default"/>
+      </w:rPr>
+    </w:lvl>
+    <w:lvl w:ilvl="2" w:tplc="08090005" w:tentative="1">
+      <w:start w:val="1"/>
+      <w:numFmt w:val="bullet"/>
+      <w:lvlText w:val=""/>
+      <w:lvlJc w:val="left"/>
+      <w:pPr>
+        <w:ind w:left="2520" w:hanging="360"/>
+      </w:pPr>
+      <w:rPr>
+        <w:rFonts w:ascii="Wingdings" w:hAnsi="Wingdings" w:hint="default"/>
+      </w:rPr>
+    </w:lvl>
+    <w:lvl w:ilvl="3" w:tplc="08090001" w:tentative="1">
+      <w:start w:val="1"/>
+      <w:numFmt w:val="bullet"/>
+      <w:lvlText w:val=""/>
+      <w:lvlJc w:val="left"/>
+      <w:pPr>
+        <w:ind w:left="3240" w:hanging="360"/>
+      </w:pPr>
+      <w:rPr>
+        <w:rFonts w:ascii="Symbol" w:hAnsi="Symbol" w:hint="default"/>
+      </w:rPr>
+    </w:lvl>
+    <w:lvl w:ilvl="4" w:tplc="08090003" w:tentative="1">
+      <w:start w:val="1"/>
+      <w:numFmt w:val="bullet"/>
+      <w:lvlText w:val="o"/>
+      <w:lvlJc w:val="left"/>
+      <w:pPr>
+        <w:ind w:left="3960" w:hanging="360"/>
+      </w:pPr>
+      <w:rPr>
+        <w:rFonts w:ascii="Courier New" w:hAnsi="Courier New" w:cs="Courier New" w:hint="default"/>
+      </w:rPr>
+    </w:lvl>
+    <w:lvl w:ilvl="5" w:tplc="08090005" w:tentative="1">
+      <w:start w:val="1"/>
+      <w:numFmt w:val="bullet"/>
+      <w:lvlText w:val=""/>
+      <w:lvlJc w:val="left"/>
+      <w:pPr>
+        <w:ind w:left="4680" w:hanging="360"/>
+      </w:pPr>
+      <w:rPr>
+        <w:rFonts w:ascii="Wingdings" w:hAnsi="Wingdings" w:hint="default"/>
+      </w:rPr>
+    </w:lvl>
+    <w:lvl w:ilvl="6" w:tplc="08090001" w:tentative="1">
+      <w:start w:val="1"/>
+      <w:numFmt w:val="bullet"/>
+      <w:lvlText w:val=""/>
+      <w:lvlJc w:val="left"/>
+      <w:pPr>
+        <w:ind w:left="5400" w:hanging="360"/>
+      </w:pPr>
+      <w:rPr>
+        <w:rFonts w:ascii="Symbol" w:hAnsi="Symbol" w:hint="default"/>
+      </w:rPr>
+    </w:lvl>
+    <w:lvl w:ilvl="7" w:tplc="08090003" w:tentative="1">
+      <w:start w:val="1"/>
+      <w:numFmt w:val="bullet"/>
+      <w:lvlText w:val="o"/>
+      <w:lvlJc w:val="left"/>
+      <w:pPr>
+        <w:ind w:left="6120" w:hanging="360"/>
+      </w:pPr>
+      <w:rPr>
+        <w:rFonts w:ascii="Courier New" w:hAnsi="Courier New" w:cs="Courier New" w:hint="default"/>
+      </w:rPr>
+    </w:lvl>
+    <w:lvl w:ilvl="8" w:tplc="08090005" w:tentative="1">
+      <w:start w:val="1"/>
+      <w:numFmt w:val="bullet"/>
+      <w:lvlText w:val=""/>
+      <w:lvlJc w:val="left"/>
+      <w:pPr>
+        <w:ind w:left="6840" w:hanging="360"/>
+      </w:pPr>
+      <w:rPr>
+        <w:rFonts w:ascii="Wingdings" w:hAnsi="Wingdings" w:hint="default"/>
+      </w:rPr>
+    </w:lvl>
+  </w:abstractNum>
+  <w:num w:numId="1" w16cid:durableId="534273550">
+    <w:abstractNumId w:val="0"/>
+  </w:num>
+</w:numbering>
 </file>
 
 <file path=word/styles.xml><?xml version="1.0" encoding="utf-8"?>
@@ -631,7 +1229,6 @@
   <w:style w:type="character" w:default="1" w:styleId="DefaultParagraphFont">
     <w:name w:val="Default Paragraph Font"/>
     <w:uiPriority w:val="1"/>
-    <w:semiHidden/>
     <w:unhideWhenUsed/>
   </w:style>
   <w:style w:type="table" w:default="1" w:styleId="TableNormal">
@@ -944,6 +1541,25 @@
       <w:color w:val="0F4761" w:themeColor="accent1" w:themeShade="BF"/>
       <w:spacing w:val="5"/>
     </w:rPr>
+  </w:style>
+  <w:style w:type="table" w:styleId="TableGrid">
+    <w:name w:val="Table Grid"/>
+    <w:basedOn w:val="TableNormal"/>
+    <w:uiPriority w:val="39"/>
+    <w:rsid w:val="00C84E08"/>
+    <w:pPr>
+      <w:spacing w:after="0" w:line="240" w:lineRule="auto"/>
+    </w:pPr>
+    <w:tblPr>
+      <w:tblBorders>
+        <w:top w:val="single" w:sz="4" w:space="0" w:color="auto"/>
+        <w:left w:val="single" w:sz="4" w:space="0" w:color="auto"/>
+        <w:bottom w:val="single" w:sz="4" w:space="0" w:color="auto"/>
+        <w:right w:val="single" w:sz="4" w:space="0" w:color="auto"/>
+        <w:insideH w:val="single" w:sz="4" w:space="0" w:color="auto"/>
+        <w:insideV w:val="single" w:sz="4" w:space="0" w:color="auto"/>
+      </w:tblBorders>
+    </w:tblPr>
   </w:style>
 </w:styles>
 </file>

</xml_diff>

<commit_message>
feat: Word document is upddated
</commit_message>
<xml_diff>
--- a/Data Base Systems/CourseWork Part A/w2151939_Part_A.docx
+++ b/Data Base Systems/CourseWork Part A/w2151939_Part_A.docx
@@ -30,6 +30,457 @@
         <w:t xml:space="preserve">Table with 2 conceptual modelling conventions and 3 semantics </w:t>
       </w:r>
     </w:p>
+    <w:p/>
+    <w:p/>
+    <w:tbl>
+      <w:tblPr>
+        <w:tblStyle w:val="TableGrid"/>
+        <w:tblW w:w="9121" w:type="dxa"/>
+        <w:tblLook w:val="04A0" w:firstRow="1" w:lastRow="0" w:firstColumn="1" w:lastColumn="0" w:noHBand="0" w:noVBand="1"/>
+      </w:tblPr>
+      <w:tblGrid>
+        <w:gridCol w:w="1776"/>
+        <w:gridCol w:w="1813"/>
+        <w:gridCol w:w="1816"/>
+        <w:gridCol w:w="1867"/>
+        <w:gridCol w:w="1849"/>
+      </w:tblGrid>
+      <w:tr>
+        <w:trPr>
+          <w:trHeight w:val="1319"/>
+        </w:trPr>
+        <w:tc>
+          <w:tcPr>
+            <w:tcW w:w="1824" w:type="dxa"/>
+          </w:tcPr>
+          <w:p>
+            <w:pPr>
+              <w:rPr>
+                <w:b/>
+                <w:bCs/>
+                <w:sz w:val="18"/>
+                <w:szCs w:val="18"/>
+              </w:rPr>
+            </w:pPr>
+            <w:r>
+              <w:rPr>
+                <w:b/>
+                <w:bCs/>
+                <w:sz w:val="18"/>
+                <w:szCs w:val="18"/>
+              </w:rPr>
+              <w:t>#</w:t>
+            </w:r>
+          </w:p>
+        </w:tc>
+        <w:tc>
+          <w:tcPr>
+            <w:tcW w:w="1824" w:type="dxa"/>
+          </w:tcPr>
+          <w:p>
+            <w:pPr>
+              <w:rPr>
+                <w:b/>
+                <w:bCs/>
+                <w:sz w:val="18"/>
+                <w:szCs w:val="18"/>
+              </w:rPr>
+            </w:pPr>
+            <w:r>
+              <w:rPr>
+                <w:b/>
+                <w:bCs/>
+                <w:sz w:val="18"/>
+                <w:szCs w:val="18"/>
+              </w:rPr>
+              <w:t>Type</w:t>
+            </w:r>
+          </w:p>
+        </w:tc>
+        <w:tc>
+          <w:tcPr>
+            <w:tcW w:w="1824" w:type="dxa"/>
+          </w:tcPr>
+          <w:p>
+            <w:pPr>
+              <w:rPr>
+                <w:b/>
+                <w:bCs/>
+                <w:sz w:val="18"/>
+                <w:szCs w:val="18"/>
+              </w:rPr>
+            </w:pPr>
+            <w:r>
+              <w:rPr>
+                <w:b/>
+                <w:bCs/>
+                <w:sz w:val="18"/>
+                <w:szCs w:val="18"/>
+              </w:rPr>
+              <w:t xml:space="preserve">Weakness: What AI-generated EERD shows </w:t>
+            </w:r>
+          </w:p>
+        </w:tc>
+        <w:tc>
+          <w:tcPr>
+            <w:tcW w:w="1824" w:type="dxa"/>
+          </w:tcPr>
+          <w:p>
+            <w:pPr>
+              <w:rPr>
+                <w:b/>
+                <w:bCs/>
+                <w:sz w:val="18"/>
+                <w:szCs w:val="18"/>
+              </w:rPr>
+            </w:pPr>
+            <w:r>
+              <w:rPr>
+                <w:b/>
+                <w:bCs/>
+                <w:sz w:val="18"/>
+                <w:szCs w:val="18"/>
+              </w:rPr>
+              <w:t>Evidence: the modelling convention (weaknesses 1-2) or a reference to a specific component of the Westlivingster brief (weaknesses 3-5)</w:t>
+            </w:r>
+          </w:p>
+        </w:tc>
+        <w:tc>
+          <w:tcPr>
+            <w:tcW w:w="1825" w:type="dxa"/>
+          </w:tcPr>
+          <w:p>
+            <w:pPr>
+              <w:rPr>
+                <w:b/>
+                <w:bCs/>
+                <w:sz w:val="18"/>
+                <w:szCs w:val="18"/>
+              </w:rPr>
+            </w:pPr>
+            <w:r>
+              <w:rPr>
+                <w:b/>
+                <w:bCs/>
+                <w:sz w:val="18"/>
+                <w:szCs w:val="18"/>
+              </w:rPr>
+              <w:t>Potential improvement: how the component could be better modelled</w:t>
+            </w:r>
+          </w:p>
+        </w:tc>
+      </w:tr>
+      <w:tr>
+        <w:trPr>
+          <w:trHeight w:val="1319"/>
+        </w:trPr>
+        <w:tc>
+          <w:tcPr>
+            <w:tcW w:w="1824" w:type="dxa"/>
+          </w:tcPr>
+          <w:p>
+            <w:pPr>
+              <w:rPr>
+                <w:b/>
+                <w:bCs/>
+              </w:rPr>
+            </w:pPr>
+            <w:r>
+              <w:rPr>
+                <w:b/>
+                <w:bCs/>
+              </w:rPr>
+              <w:t>1</w:t>
+            </w:r>
+          </w:p>
+        </w:tc>
+        <w:tc>
+          <w:tcPr>
+            <w:tcW w:w="1824" w:type="dxa"/>
+          </w:tcPr>
+          <w:p>
+            <w:r>
+              <w:t xml:space="preserve">Conceptual </w:t>
+            </w:r>
+          </w:p>
+          <w:p>
+            <w:r>
+              <w:t xml:space="preserve">Modelling conventions </w:t>
+            </w:r>
+          </w:p>
+        </w:tc>
+        <w:tc>
+          <w:tcPr>
+            <w:tcW w:w="1824" w:type="dxa"/>
+          </w:tcPr>
+          <w:p>
+            <w:r>
+              <w:t>The conceptual diagram includes foreign keys (FK) in entities like Tenant, Owner, Electric vehicle and Fuel Vehicle.</w:t>
+            </w:r>
+          </w:p>
+          <w:p/>
+        </w:tc>
+        <w:tc>
+          <w:tcPr>
+            <w:tcW w:w="1824" w:type="dxa"/>
+          </w:tcPr>
+          <w:p>
+            <w:r>
+              <w:t>Conceptual models are focused on business concepts and should not include logical implementation details.</w:t>
+            </w:r>
+          </w:p>
+        </w:tc>
+        <w:tc>
+          <w:tcPr>
+            <w:tcW w:w="1825" w:type="dxa"/>
+          </w:tcPr>
+          <w:p>
+            <w:r>
+              <w:t>All Foreign Keys (FK) must be removed from the entities.</w:t>
+            </w:r>
+          </w:p>
+        </w:tc>
+      </w:tr>
+      <w:tr>
+        <w:trPr>
+          <w:trHeight w:val="1369"/>
+        </w:trPr>
+        <w:tc>
+          <w:tcPr>
+            <w:tcW w:w="1824" w:type="dxa"/>
+          </w:tcPr>
+          <w:p>
+            <w:pPr>
+              <w:rPr>
+                <w:b/>
+                <w:bCs/>
+              </w:rPr>
+            </w:pPr>
+            <w:r>
+              <w:rPr>
+                <w:b/>
+                <w:bCs/>
+              </w:rPr>
+              <w:t>2</w:t>
+            </w:r>
+          </w:p>
+        </w:tc>
+        <w:tc>
+          <w:tcPr>
+            <w:tcW w:w="1824" w:type="dxa"/>
+          </w:tcPr>
+          <w:p>
+            <w:r>
+              <w:t xml:space="preserve">Conceptual modelling conventions </w:t>
+            </w:r>
+          </w:p>
+        </w:tc>
+        <w:tc>
+          <w:tcPr>
+            <w:tcW w:w="1824" w:type="dxa"/>
+          </w:tcPr>
+          <w:p>
+            <w:r>
+              <w:t>The conceptual diagram uses diamond shapes to represent verbs.</w:t>
+            </w:r>
+          </w:p>
+        </w:tc>
+        <w:tc>
+          <w:tcPr>
+            <w:tcW w:w="1824" w:type="dxa"/>
+          </w:tcPr>
+          <w:p>
+            <w:r>
+              <w:t>The UML notation requirements for conceptual modelling specify the use of lines with reading direction arrows.</w:t>
+            </w:r>
+          </w:p>
+        </w:tc>
+        <w:tc>
+          <w:tcPr>
+            <w:tcW w:w="1825" w:type="dxa"/>
+          </w:tcPr>
+          <w:p>
+            <w:r>
+              <w:t>Replace all diamond shapes with the correct UML notation for relationships representations (straight lines containing a verb and an arrow indicating the reading direction)</w:t>
+            </w:r>
+          </w:p>
+          <w:p/>
+        </w:tc>
+      </w:tr>
+      <w:tr>
+        <w:trPr>
+          <w:trHeight w:val="1319"/>
+        </w:trPr>
+        <w:tc>
+          <w:tcPr>
+            <w:tcW w:w="1824" w:type="dxa"/>
+          </w:tcPr>
+          <w:p>
+            <w:pPr>
+              <w:rPr>
+                <w:b/>
+                <w:bCs/>
+              </w:rPr>
+            </w:pPr>
+            <w:r>
+              <w:rPr>
+                <w:b/>
+                <w:bCs/>
+              </w:rPr>
+              <w:t>3</w:t>
+            </w:r>
+          </w:p>
+        </w:tc>
+        <w:tc>
+          <w:tcPr>
+            <w:tcW w:w="1824" w:type="dxa"/>
+          </w:tcPr>
+          <w:p>
+            <w:r>
+              <w:t xml:space="preserve">Semantics </w:t>
+            </w:r>
+          </w:p>
+        </w:tc>
+        <w:tc>
+          <w:tcPr>
+            <w:tcW w:w="1824" w:type="dxa"/>
+          </w:tcPr>
+          <w:p>
+            <w:r>
+              <w:t xml:space="preserve">The Owner entity has no relationship connecting it to the Apartment entity, and a </w:t>
+            </w:r>
+            <w:r>
+              <w:lastRenderedPageBreak/>
+              <w:t>constrain to the resident entity</w:t>
+            </w:r>
+          </w:p>
+        </w:tc>
+        <w:tc>
+          <w:tcPr>
+            <w:tcW w:w="1824" w:type="dxa"/>
+          </w:tcPr>
+          <w:p/>
+        </w:tc>
+        <w:tc>
+          <w:tcPr>
+            <w:tcW w:w="1825" w:type="dxa"/>
+          </w:tcPr>
+          <w:p/>
+        </w:tc>
+      </w:tr>
+      <w:tr>
+        <w:trPr>
+          <w:trHeight w:val="1319"/>
+        </w:trPr>
+        <w:tc>
+          <w:tcPr>
+            <w:tcW w:w="1824" w:type="dxa"/>
+          </w:tcPr>
+          <w:p>
+            <w:pPr>
+              <w:rPr>
+                <w:b/>
+                <w:bCs/>
+              </w:rPr>
+            </w:pPr>
+            <w:r>
+              <w:rPr>
+                <w:b/>
+                <w:bCs/>
+              </w:rPr>
+              <w:t>4</w:t>
+            </w:r>
+          </w:p>
+        </w:tc>
+        <w:tc>
+          <w:tcPr>
+            <w:tcW w:w="1824" w:type="dxa"/>
+          </w:tcPr>
+          <w:p>
+            <w:r>
+              <w:t xml:space="preserve">Semantics </w:t>
+            </w:r>
+          </w:p>
+        </w:tc>
+        <w:tc>
+          <w:tcPr>
+            <w:tcW w:w="1824" w:type="dxa"/>
+          </w:tcPr>
+          <w:p>
+            <w:r>
+              <w:t>The multiplicities include a capitalized letter “M” to represent the participation or cardinality of the the mu</w:t>
+            </w:r>
+          </w:p>
+        </w:tc>
+        <w:tc>
+          <w:tcPr>
+            <w:tcW w:w="1824" w:type="dxa"/>
+          </w:tcPr>
+          <w:p/>
+        </w:tc>
+        <w:tc>
+          <w:tcPr>
+            <w:tcW w:w="1825" w:type="dxa"/>
+          </w:tcPr>
+          <w:p/>
+        </w:tc>
+      </w:tr>
+      <w:tr>
+        <w:trPr>
+          <w:trHeight w:val="1319"/>
+        </w:trPr>
+        <w:tc>
+          <w:tcPr>
+            <w:tcW w:w="1824" w:type="dxa"/>
+          </w:tcPr>
+          <w:p>
+            <w:pPr>
+              <w:rPr>
+                <w:b/>
+                <w:bCs/>
+              </w:rPr>
+            </w:pPr>
+            <w:r>
+              <w:rPr>
+                <w:b/>
+                <w:bCs/>
+              </w:rPr>
+              <w:t>5</w:t>
+            </w:r>
+          </w:p>
+        </w:tc>
+        <w:tc>
+          <w:tcPr>
+            <w:tcW w:w="1824" w:type="dxa"/>
+          </w:tcPr>
+          <w:p>
+            <w:r>
+              <w:t xml:space="preserve">Semantics </w:t>
+            </w:r>
+          </w:p>
+        </w:tc>
+        <w:tc>
+          <w:tcPr>
+            <w:tcW w:w="1824" w:type="dxa"/>
+          </w:tcPr>
+          <w:p/>
+        </w:tc>
+        <w:tc>
+          <w:tcPr>
+            <w:tcW w:w="1824" w:type="dxa"/>
+          </w:tcPr>
+          <w:p/>
+        </w:tc>
+        <w:tc>
+          <w:tcPr>
+            <w:tcW w:w="1825" w:type="dxa"/>
+          </w:tcPr>
+          <w:p/>
+        </w:tc>
+      </w:tr>
+    </w:tbl>
+    <w:p/>
+    <w:p/>
     <w:p/>
     <w:p>
       <w:r>
@@ -84,414 +535,6 @@
         <w:t xml:space="preserve">Table 2 Relationships and multiplicities </w:t>
       </w:r>
     </w:p>
-    <w:p/>
-    <w:tbl>
-      <w:tblPr>
-        <w:tblStyle w:val="TableGrid"/>
-        <w:tblW w:w="9121" w:type="dxa"/>
-        <w:tblLook w:val="04A0" w:firstRow="1" w:lastRow="0" w:firstColumn="1" w:lastColumn="0" w:noHBand="0" w:noVBand="1"/>
-      </w:tblPr>
-      <w:tblGrid>
-        <w:gridCol w:w="1824"/>
-        <w:gridCol w:w="1824"/>
-        <w:gridCol w:w="1824"/>
-        <w:gridCol w:w="1824"/>
-        <w:gridCol w:w="1825"/>
-      </w:tblGrid>
-      <w:tr>
-        <w:trPr>
-          <w:trHeight w:val="1319"/>
-        </w:trPr>
-        <w:tc>
-          <w:tcPr>
-            <w:tcW w:w="1824" w:type="dxa"/>
-          </w:tcPr>
-          <w:p>
-            <w:pPr>
-              <w:rPr>
-                <w:b/>
-                <w:bCs/>
-                <w:sz w:val="18"/>
-                <w:szCs w:val="18"/>
-              </w:rPr>
-            </w:pPr>
-            <w:r>
-              <w:rPr>
-                <w:b/>
-                <w:bCs/>
-                <w:sz w:val="18"/>
-                <w:szCs w:val="18"/>
-              </w:rPr>
-              <w:t>#</w:t>
-            </w:r>
-          </w:p>
-        </w:tc>
-        <w:tc>
-          <w:tcPr>
-            <w:tcW w:w="1824" w:type="dxa"/>
-          </w:tcPr>
-          <w:p>
-            <w:pPr>
-              <w:rPr>
-                <w:b/>
-                <w:bCs/>
-                <w:sz w:val="18"/>
-                <w:szCs w:val="18"/>
-              </w:rPr>
-            </w:pPr>
-            <w:r>
-              <w:rPr>
-                <w:b/>
-                <w:bCs/>
-                <w:sz w:val="18"/>
-                <w:szCs w:val="18"/>
-              </w:rPr>
-              <w:t>Type</w:t>
-            </w:r>
-          </w:p>
-        </w:tc>
-        <w:tc>
-          <w:tcPr>
-            <w:tcW w:w="1824" w:type="dxa"/>
-          </w:tcPr>
-          <w:p>
-            <w:pPr>
-              <w:rPr>
-                <w:b/>
-                <w:bCs/>
-                <w:sz w:val="18"/>
-                <w:szCs w:val="18"/>
-              </w:rPr>
-            </w:pPr>
-            <w:r>
-              <w:rPr>
-                <w:b/>
-                <w:bCs/>
-                <w:sz w:val="18"/>
-                <w:szCs w:val="18"/>
-              </w:rPr>
-              <w:t xml:space="preserve">Weakness: What AI-generated EERD shows </w:t>
-            </w:r>
-          </w:p>
-        </w:tc>
-        <w:tc>
-          <w:tcPr>
-            <w:tcW w:w="1824" w:type="dxa"/>
-          </w:tcPr>
-          <w:p>
-            <w:pPr>
-              <w:rPr>
-                <w:b/>
-                <w:bCs/>
-                <w:sz w:val="18"/>
-                <w:szCs w:val="18"/>
-              </w:rPr>
-            </w:pPr>
-            <w:r>
-              <w:rPr>
-                <w:b/>
-                <w:bCs/>
-                <w:sz w:val="18"/>
-                <w:szCs w:val="18"/>
-              </w:rPr>
-              <w:t xml:space="preserve">Evidence: the modelling convention (weaknesses 1-2) or a reference to a specific component of the </w:t>
-            </w:r>
-            <w:proofErr w:type="spellStart"/>
-            <w:r>
-              <w:rPr>
-                <w:b/>
-                <w:bCs/>
-                <w:sz w:val="18"/>
-                <w:szCs w:val="18"/>
-              </w:rPr>
-              <w:t>Westlivingster</w:t>
-            </w:r>
-            <w:proofErr w:type="spellEnd"/>
-            <w:r>
-              <w:rPr>
-                <w:b/>
-                <w:bCs/>
-                <w:sz w:val="18"/>
-                <w:szCs w:val="18"/>
-              </w:rPr>
-              <w:t xml:space="preserve"> brief (weaknesses 3-5)</w:t>
-            </w:r>
-          </w:p>
-        </w:tc>
-        <w:tc>
-          <w:tcPr>
-            <w:tcW w:w="1825" w:type="dxa"/>
-          </w:tcPr>
-          <w:p>
-            <w:pPr>
-              <w:rPr>
-                <w:b/>
-                <w:bCs/>
-                <w:sz w:val="18"/>
-                <w:szCs w:val="18"/>
-              </w:rPr>
-            </w:pPr>
-            <w:r>
-              <w:rPr>
-                <w:b/>
-                <w:bCs/>
-                <w:sz w:val="18"/>
-                <w:szCs w:val="18"/>
-              </w:rPr>
-              <w:t>Potential improvement: how the component could be better modelled</w:t>
-            </w:r>
-          </w:p>
-        </w:tc>
-      </w:tr>
-      <w:tr>
-        <w:trPr>
-          <w:trHeight w:val="1319"/>
-        </w:trPr>
-        <w:tc>
-          <w:tcPr>
-            <w:tcW w:w="1824" w:type="dxa"/>
-          </w:tcPr>
-          <w:p>
-            <w:pPr>
-              <w:rPr>
-                <w:b/>
-                <w:bCs/>
-              </w:rPr>
-            </w:pPr>
-            <w:r>
-              <w:rPr>
-                <w:b/>
-                <w:bCs/>
-              </w:rPr>
-              <w:t>1</w:t>
-            </w:r>
-          </w:p>
-        </w:tc>
-        <w:tc>
-          <w:tcPr>
-            <w:tcW w:w="1824" w:type="dxa"/>
-          </w:tcPr>
-          <w:p/>
-        </w:tc>
-        <w:tc>
-          <w:tcPr>
-            <w:tcW w:w="1824" w:type="dxa"/>
-          </w:tcPr>
-          <w:p/>
-        </w:tc>
-        <w:tc>
-          <w:tcPr>
-            <w:tcW w:w="1824" w:type="dxa"/>
-          </w:tcPr>
-          <w:p/>
-        </w:tc>
-        <w:tc>
-          <w:tcPr>
-            <w:tcW w:w="1825" w:type="dxa"/>
-          </w:tcPr>
-          <w:p/>
-        </w:tc>
-      </w:tr>
-      <w:tr>
-        <w:trPr>
-          <w:trHeight w:val="1369"/>
-        </w:trPr>
-        <w:tc>
-          <w:tcPr>
-            <w:tcW w:w="1824" w:type="dxa"/>
-          </w:tcPr>
-          <w:p>
-            <w:pPr>
-              <w:rPr>
-                <w:b/>
-                <w:bCs/>
-              </w:rPr>
-            </w:pPr>
-            <w:r>
-              <w:rPr>
-                <w:b/>
-                <w:bCs/>
-              </w:rPr>
-              <w:t>2</w:t>
-            </w:r>
-          </w:p>
-        </w:tc>
-        <w:tc>
-          <w:tcPr>
-            <w:tcW w:w="1824" w:type="dxa"/>
-          </w:tcPr>
-          <w:p/>
-        </w:tc>
-        <w:tc>
-          <w:tcPr>
-            <w:tcW w:w="1824" w:type="dxa"/>
-          </w:tcPr>
-          <w:p/>
-        </w:tc>
-        <w:tc>
-          <w:tcPr>
-            <w:tcW w:w="1824" w:type="dxa"/>
-          </w:tcPr>
-          <w:p/>
-        </w:tc>
-        <w:tc>
-          <w:tcPr>
-            <w:tcW w:w="1825" w:type="dxa"/>
-          </w:tcPr>
-          <w:p/>
-        </w:tc>
-      </w:tr>
-      <w:tr>
-        <w:trPr>
-          <w:trHeight w:val="1319"/>
-        </w:trPr>
-        <w:tc>
-          <w:tcPr>
-            <w:tcW w:w="1824" w:type="dxa"/>
-          </w:tcPr>
-          <w:p>
-            <w:pPr>
-              <w:rPr>
-                <w:b/>
-                <w:bCs/>
-              </w:rPr>
-            </w:pPr>
-            <w:r>
-              <w:rPr>
-                <w:b/>
-                <w:bCs/>
-              </w:rPr>
-              <w:t>3</w:t>
-            </w:r>
-          </w:p>
-        </w:tc>
-        <w:tc>
-          <w:tcPr>
-            <w:tcW w:w="1824" w:type="dxa"/>
-          </w:tcPr>
-          <w:p/>
-        </w:tc>
-        <w:tc>
-          <w:tcPr>
-            <w:tcW w:w="1824" w:type="dxa"/>
-          </w:tcPr>
-          <w:p/>
-        </w:tc>
-        <w:tc>
-          <w:tcPr>
-            <w:tcW w:w="1824" w:type="dxa"/>
-          </w:tcPr>
-          <w:p/>
-        </w:tc>
-        <w:tc>
-          <w:tcPr>
-            <w:tcW w:w="1825" w:type="dxa"/>
-          </w:tcPr>
-          <w:p/>
-        </w:tc>
-      </w:tr>
-      <w:tr>
-        <w:trPr>
-          <w:trHeight w:val="1319"/>
-        </w:trPr>
-        <w:tc>
-          <w:tcPr>
-            <w:tcW w:w="1824" w:type="dxa"/>
-          </w:tcPr>
-          <w:p>
-            <w:pPr>
-              <w:rPr>
-                <w:b/>
-                <w:bCs/>
-              </w:rPr>
-            </w:pPr>
-            <w:r>
-              <w:rPr>
-                <w:b/>
-                <w:bCs/>
-              </w:rPr>
-              <w:t>4</w:t>
-            </w:r>
-          </w:p>
-        </w:tc>
-        <w:tc>
-          <w:tcPr>
-            <w:tcW w:w="1824" w:type="dxa"/>
-          </w:tcPr>
-          <w:p/>
-        </w:tc>
-        <w:tc>
-          <w:tcPr>
-            <w:tcW w:w="1824" w:type="dxa"/>
-          </w:tcPr>
-          <w:p/>
-        </w:tc>
-        <w:tc>
-          <w:tcPr>
-            <w:tcW w:w="1824" w:type="dxa"/>
-          </w:tcPr>
-          <w:p/>
-        </w:tc>
-        <w:tc>
-          <w:tcPr>
-            <w:tcW w:w="1825" w:type="dxa"/>
-          </w:tcPr>
-          <w:p/>
-        </w:tc>
-      </w:tr>
-      <w:tr>
-        <w:trPr>
-          <w:trHeight w:val="1319"/>
-        </w:trPr>
-        <w:tc>
-          <w:tcPr>
-            <w:tcW w:w="1824" w:type="dxa"/>
-          </w:tcPr>
-          <w:p>
-            <w:pPr>
-              <w:rPr>
-                <w:b/>
-                <w:bCs/>
-              </w:rPr>
-            </w:pPr>
-            <w:r>
-              <w:rPr>
-                <w:b/>
-                <w:bCs/>
-              </w:rPr>
-              <w:t>5</w:t>
-            </w:r>
-          </w:p>
-        </w:tc>
-        <w:tc>
-          <w:tcPr>
-            <w:tcW w:w="1824" w:type="dxa"/>
-          </w:tcPr>
-          <w:p/>
-        </w:tc>
-        <w:tc>
-          <w:tcPr>
-            <w:tcW w:w="1824" w:type="dxa"/>
-          </w:tcPr>
-          <w:p/>
-        </w:tc>
-        <w:tc>
-          <w:tcPr>
-            <w:tcW w:w="1824" w:type="dxa"/>
-          </w:tcPr>
-          <w:p/>
-        </w:tc>
-        <w:tc>
-          <w:tcPr>
-            <w:tcW w:w="1825" w:type="dxa"/>
-          </w:tcPr>
-          <w:p/>
-        </w:tc>
-      </w:tr>
-    </w:tbl>
-    <w:p/>
-    <w:p/>
-    <w:p/>
     <w:p/>
     <w:p/>
     <w:p/>
@@ -1229,6 +1272,7 @@
   <w:style w:type="character" w:default="1" w:styleId="DefaultParagraphFont">
     <w:name w:val="Default Paragraph Font"/>
     <w:uiPriority w:val="1"/>
+    <w:semiHidden/>
     <w:unhideWhenUsed/>
   </w:style>
   <w:style w:type="table" w:default="1" w:styleId="TableNormal">

</xml_diff>

<commit_message>
feat: New doucments for coursework SEP added, CK1 and CK2
</commit_message>
<xml_diff>
--- a/Data Base Systems/CourseWork Part A/w2151939_Part_A.docx
+++ b/Data Base Systems/CourseWork Part A/w2151939_Part_A.docx
@@ -469,7 +469,11 @@
           <w:tcPr>
             <w:tcW w:w="1824" w:type="dxa"/>
           </w:tcPr>
-          <w:p/>
+          <w:p>
+            <w:r>
+              <w:t>r</w:t>
+            </w:r>
+          </w:p>
         </w:tc>
         <w:tc>
           <w:tcPr>

</xml_diff>

<commit_message>
feat: New files for week 5 DBS added
</commit_message>
<xml_diff>
--- a/Data Base Systems/CourseWork Part A/w2151939_Part_A.docx
+++ b/Data Base Systems/CourseWork Part A/w2151939_Part_A.docx
@@ -39,9 +39,9 @@
         <w:tblLook w:val="04A0" w:firstRow="1" w:lastRow="0" w:firstColumn="1" w:lastColumn="0" w:noHBand="0" w:noVBand="1"/>
       </w:tblPr>
       <w:tblGrid>
-        <w:gridCol w:w="1776"/>
+        <w:gridCol w:w="1778"/>
+        <w:gridCol w:w="1814"/>
         <w:gridCol w:w="1813"/>
-        <w:gridCol w:w="1816"/>
         <w:gridCol w:w="1867"/>
         <w:gridCol w:w="1849"/>
       </w:tblGrid>
@@ -51,7 +51,7 @@
         </w:trPr>
         <w:tc>
           <w:tcPr>
-            <w:tcW w:w="1824" w:type="dxa"/>
+            <w:tcW w:w="1778" w:type="dxa"/>
           </w:tcPr>
           <w:p>
             <w:pPr>
@@ -75,7 +75,7 @@
         </w:tc>
         <w:tc>
           <w:tcPr>
-            <w:tcW w:w="1824" w:type="dxa"/>
+            <w:tcW w:w="1814" w:type="dxa"/>
           </w:tcPr>
           <w:p>
             <w:pPr>
@@ -99,7 +99,7 @@
         </w:tc>
         <w:tc>
           <w:tcPr>
-            <w:tcW w:w="1824" w:type="dxa"/>
+            <w:tcW w:w="1813" w:type="dxa"/>
           </w:tcPr>
           <w:p>
             <w:pPr>
@@ -123,7 +123,7 @@
         </w:tc>
         <w:tc>
           <w:tcPr>
-            <w:tcW w:w="1824" w:type="dxa"/>
+            <w:tcW w:w="1867" w:type="dxa"/>
           </w:tcPr>
           <w:p>
             <w:pPr>
@@ -141,13 +141,33 @@
                 <w:sz w:val="18"/>
                 <w:szCs w:val="18"/>
               </w:rPr>
-              <w:t>Evidence: the modelling convention (weaknesses 1-2) or a reference to a specific component of the Westlivingster brief (weaknesses 3-5)</w:t>
-            </w:r>
-          </w:p>
-        </w:tc>
-        <w:tc>
-          <w:tcPr>
-            <w:tcW w:w="1825" w:type="dxa"/>
+              <w:t xml:space="preserve">Evidence: the modelling convention (weaknesses 1-2) or a reference to a specific component of the </w:t>
+            </w:r>
+            <w:proofErr w:type="spellStart"/>
+            <w:r>
+              <w:rPr>
+                <w:b/>
+                <w:bCs/>
+                <w:sz w:val="18"/>
+                <w:szCs w:val="18"/>
+              </w:rPr>
+              <w:t>Westlivingster</w:t>
+            </w:r>
+            <w:proofErr w:type="spellEnd"/>
+            <w:r>
+              <w:rPr>
+                <w:b/>
+                <w:bCs/>
+                <w:sz w:val="18"/>
+                <w:szCs w:val="18"/>
+              </w:rPr>
+              <w:t xml:space="preserve"> brief (weaknesses 3-5)</w:t>
+            </w:r>
+          </w:p>
+        </w:tc>
+        <w:tc>
+          <w:tcPr>
+            <w:tcW w:w="1849" w:type="dxa"/>
           </w:tcPr>
           <w:p>
             <w:pPr>
@@ -176,7 +196,7 @@
         </w:trPr>
         <w:tc>
           <w:tcPr>
-            <w:tcW w:w="1824" w:type="dxa"/>
+            <w:tcW w:w="1778" w:type="dxa"/>
           </w:tcPr>
           <w:p>
             <w:pPr>
@@ -196,7 +216,7 @@
         </w:tc>
         <w:tc>
           <w:tcPr>
-            <w:tcW w:w="1824" w:type="dxa"/>
+            <w:tcW w:w="1814" w:type="dxa"/>
           </w:tcPr>
           <w:p>
             <w:r>
@@ -211,7 +231,7 @@
         </w:tc>
         <w:tc>
           <w:tcPr>
-            <w:tcW w:w="1824" w:type="dxa"/>
+            <w:tcW w:w="1813" w:type="dxa"/>
           </w:tcPr>
           <w:p>
             <w:r>
@@ -222,7 +242,7 @@
         </w:tc>
         <w:tc>
           <w:tcPr>
-            <w:tcW w:w="1824" w:type="dxa"/>
+            <w:tcW w:w="1867" w:type="dxa"/>
           </w:tcPr>
           <w:p>
             <w:r>
@@ -232,7 +252,7 @@
         </w:tc>
         <w:tc>
           <w:tcPr>
-            <w:tcW w:w="1825" w:type="dxa"/>
+            <w:tcW w:w="1849" w:type="dxa"/>
           </w:tcPr>
           <w:p>
             <w:r>
@@ -247,7 +267,7 @@
         </w:trPr>
         <w:tc>
           <w:tcPr>
-            <w:tcW w:w="1824" w:type="dxa"/>
+            <w:tcW w:w="1778" w:type="dxa"/>
           </w:tcPr>
           <w:p>
             <w:pPr>
@@ -267,7 +287,7 @@
         </w:tc>
         <w:tc>
           <w:tcPr>
-            <w:tcW w:w="1824" w:type="dxa"/>
+            <w:tcW w:w="1814" w:type="dxa"/>
           </w:tcPr>
           <w:p>
             <w:r>
@@ -277,7 +297,7 @@
         </w:tc>
         <w:tc>
           <w:tcPr>
-            <w:tcW w:w="1824" w:type="dxa"/>
+            <w:tcW w:w="1813" w:type="dxa"/>
           </w:tcPr>
           <w:p>
             <w:r>
@@ -287,7 +307,7 @@
         </w:tc>
         <w:tc>
           <w:tcPr>
-            <w:tcW w:w="1824" w:type="dxa"/>
+            <w:tcW w:w="1867" w:type="dxa"/>
           </w:tcPr>
           <w:p>
             <w:r>
@@ -297,7 +317,7 @@
         </w:tc>
         <w:tc>
           <w:tcPr>
-            <w:tcW w:w="1825" w:type="dxa"/>
+            <w:tcW w:w="1849" w:type="dxa"/>
           </w:tcPr>
           <w:p>
             <w:r>
@@ -313,7 +333,7 @@
         </w:trPr>
         <w:tc>
           <w:tcPr>
-            <w:tcW w:w="1824" w:type="dxa"/>
+            <w:tcW w:w="1778" w:type="dxa"/>
           </w:tcPr>
           <w:p>
             <w:pPr>
@@ -333,7 +353,7 @@
         </w:tc>
         <w:tc>
           <w:tcPr>
-            <w:tcW w:w="1824" w:type="dxa"/>
+            <w:tcW w:w="1814" w:type="dxa"/>
           </w:tcPr>
           <w:p>
             <w:r>
@@ -343,29 +363,48 @@
         </w:tc>
         <w:tc>
           <w:tcPr>
-            <w:tcW w:w="1824" w:type="dxa"/>
-          </w:tcPr>
-          <w:p>
-            <w:r>
-              <w:t xml:space="preserve">The Owner entity has no relationship connecting it to the Apartment entity, and a </w:t>
+            <w:tcW w:w="1813" w:type="dxa"/>
+          </w:tcPr>
+          <w:p>
+            <w:r>
+              <w:t xml:space="preserve">The Owner entity has no relationship connecting it to the Apartment </w:t>
             </w:r>
             <w:r>
               <w:lastRenderedPageBreak/>
-              <w:t>constrain to the resident entity</w:t>
-            </w:r>
-          </w:p>
-        </w:tc>
-        <w:tc>
-          <w:tcPr>
-            <w:tcW w:w="1824" w:type="dxa"/>
-          </w:tcPr>
-          <w:p/>
-        </w:tc>
-        <w:tc>
-          <w:tcPr>
-            <w:tcW w:w="1825" w:type="dxa"/>
-          </w:tcPr>
-          <w:p/>
+              <w:t>entity, and a constrain to the resident entity</w:t>
+            </w:r>
+            <w:r>
+              <w:t>.</w:t>
+            </w:r>
+          </w:p>
+        </w:tc>
+        <w:tc>
+          <w:tcPr>
+            <w:tcW w:w="1867" w:type="dxa"/>
+          </w:tcPr>
+          <w:p>
+            <w:r>
+              <w:lastRenderedPageBreak/>
+              <w:t>The brief clarifies that residents can buy an apartment or rent it.</w:t>
+            </w:r>
+          </w:p>
+        </w:tc>
+        <w:tc>
+          <w:tcPr>
+            <w:tcW w:w="1849" w:type="dxa"/>
+          </w:tcPr>
+          <w:p>
+            <w:r>
+              <w:t xml:space="preserve">Add a relation ship that connects the entities Owner and Apartment </w:t>
+            </w:r>
+            <w:r>
+              <w:t xml:space="preserve">that states that </w:t>
+            </w:r>
+            <w:r>
+              <w:lastRenderedPageBreak/>
+              <w:t>an apartment can have an owner or a tenant.</w:t>
+            </w:r>
+          </w:p>
         </w:tc>
       </w:tr>
       <w:tr>
@@ -374,7 +413,7 @@
         </w:trPr>
         <w:tc>
           <w:tcPr>
-            <w:tcW w:w="1824" w:type="dxa"/>
+            <w:tcW w:w="1778" w:type="dxa"/>
           </w:tcPr>
           <w:p>
             <w:pPr>
@@ -394,7 +433,7 @@
         </w:tc>
         <w:tc>
           <w:tcPr>
-            <w:tcW w:w="1824" w:type="dxa"/>
+            <w:tcW w:w="1814" w:type="dxa"/>
           </w:tcPr>
           <w:p>
             <w:r>
@@ -404,25 +443,34 @@
         </w:tc>
         <w:tc>
           <w:tcPr>
-            <w:tcW w:w="1824" w:type="dxa"/>
-          </w:tcPr>
-          <w:p>
-            <w:r>
-              <w:t>The multiplicities include a capitalized letter “M” to represent the participation or cardinality of the the mu</w:t>
-            </w:r>
-          </w:p>
-        </w:tc>
-        <w:tc>
-          <w:tcPr>
-            <w:tcW w:w="1824" w:type="dxa"/>
-          </w:tcPr>
+            <w:tcW w:w="1813" w:type="dxa"/>
+          </w:tcPr>
+          <w:p>
+            <w:r>
+              <w:t>The entities Vehicle and Visitor does not have a relationship, not including the possibility that visitors can also have a car.</w:t>
+            </w:r>
+          </w:p>
           <w:p/>
         </w:tc>
         <w:tc>
           <w:tcPr>
-            <w:tcW w:w="1825" w:type="dxa"/>
-          </w:tcPr>
-          <w:p/>
+            <w:tcW w:w="1867" w:type="dxa"/>
+          </w:tcPr>
+          <w:p>
+            <w:r>
+              <w:t>When the brief describes the parking structure, it mentions that both residents and visitors can have a vehicle.</w:t>
+            </w:r>
+          </w:p>
+        </w:tc>
+        <w:tc>
+          <w:tcPr>
+            <w:tcW w:w="1849" w:type="dxa"/>
+          </w:tcPr>
+          <w:p>
+            <w:r>
+              <w:t>Add a relation ship between Vehicle and Visitor that states the possibility for the visitors to also have a car.</w:t>
+            </w:r>
+          </w:p>
         </w:tc>
       </w:tr>
       <w:tr>
@@ -431,7 +479,7 @@
         </w:trPr>
         <w:tc>
           <w:tcPr>
-            <w:tcW w:w="1824" w:type="dxa"/>
+            <w:tcW w:w="1778" w:type="dxa"/>
           </w:tcPr>
           <w:p>
             <w:pPr>
@@ -451,7 +499,7 @@
         </w:tc>
         <w:tc>
           <w:tcPr>
-            <w:tcW w:w="1824" w:type="dxa"/>
+            <w:tcW w:w="1814" w:type="dxa"/>
           </w:tcPr>
           <w:p>
             <w:r>
@@ -461,25 +509,39 @@
         </w:tc>
         <w:tc>
           <w:tcPr>
-            <w:tcW w:w="1824" w:type="dxa"/>
-          </w:tcPr>
-          <w:p/>
-        </w:tc>
-        <w:tc>
-          <w:tcPr>
-            <w:tcW w:w="1824" w:type="dxa"/>
-          </w:tcPr>
-          <w:p>
-            <w:r>
-              <w:t>r</w:t>
-            </w:r>
-          </w:p>
-        </w:tc>
-        <w:tc>
-          <w:tcPr>
-            <w:tcW w:w="1825" w:type="dxa"/>
-          </w:tcPr>
-          <w:p/>
+            <w:tcW w:w="1813" w:type="dxa"/>
+          </w:tcPr>
+          <w:p>
+            <w:r>
+              <w:t>The mu</w:t>
+            </w:r>
+            <w:r>
+              <w:t>ltiplicities implemented along the diagram shows an “M” and a single digit number.</w:t>
+            </w:r>
+          </w:p>
+        </w:tc>
+        <w:tc>
+          <w:tcPr>
+            <w:tcW w:w="1867" w:type="dxa"/>
+          </w:tcPr>
+          <w:p>
+            <w:r>
+              <w:t xml:space="preserve"> </w:t>
+            </w:r>
+            <w:r>
+              <w:t>The brief states that there is only one tenant assigned as the lead tenant and is the only one responsible for the agreement.</w:t>
+            </w:r>
+          </w:p>
+        </w:tc>
+        <w:tc>
+          <w:tcPr>
+            <w:tcW w:w="1849" w:type="dxa"/>
+          </w:tcPr>
+          <w:p>
+            <w:r>
+              <w:t>Change the format for the multiplicities for an appropriate format that include participation and cardinality on both sides of the entities.</w:t>
+            </w:r>
+          </w:p>
         </w:tc>
       </w:tr>
     </w:tbl>
@@ -539,6 +601,286 @@
         <w:t xml:space="preserve">Table 2 Relationships and multiplicities </w:t>
       </w:r>
     </w:p>
+    <w:tbl>
+      <w:tblPr>
+        <w:tblStyle w:val="TableGrid"/>
+        <w:tblW w:w="0" w:type="auto"/>
+        <w:tblLook w:val="04A0" w:firstRow="1" w:lastRow="0" w:firstColumn="1" w:lastColumn="0" w:noHBand="0" w:noVBand="1"/>
+      </w:tblPr>
+      <w:tblGrid>
+        <w:gridCol w:w="3145"/>
+        <w:gridCol w:w="5871"/>
+      </w:tblGrid>
+      <w:tr>
+        <w:tc>
+          <w:tcPr>
+            <w:tcW w:w="2547" w:type="dxa"/>
+          </w:tcPr>
+          <w:p>
+            <w:pPr>
+              <w:rPr>
+                <w:b/>
+                <w:bCs/>
+              </w:rPr>
+            </w:pPr>
+            <w:r>
+              <w:rPr>
+                <w:b/>
+                <w:bCs/>
+              </w:rPr>
+              <w:t>Entity</w:t>
+            </w:r>
+          </w:p>
+        </w:tc>
+        <w:tc>
+          <w:tcPr>
+            <w:tcW w:w="6469" w:type="dxa"/>
+          </w:tcPr>
+          <w:p>
+            <w:pPr>
+              <w:rPr>
+                <w:b/>
+                <w:bCs/>
+              </w:rPr>
+            </w:pPr>
+            <w:r>
+              <w:rPr>
+                <w:b/>
+                <w:bCs/>
+              </w:rPr>
+              <w:t>Specialised sub-types and constraint (if any)</w:t>
+            </w:r>
+          </w:p>
+        </w:tc>
+      </w:tr>
+      <w:tr>
+        <w:tc>
+          <w:tcPr>
+            <w:tcW w:w="2547" w:type="dxa"/>
+          </w:tcPr>
+          <w:p>
+            <w:r>
+              <w:t>W2151939_Building</w:t>
+            </w:r>
+          </w:p>
+        </w:tc>
+        <w:tc>
+          <w:tcPr>
+            <w:tcW w:w="6469" w:type="dxa"/>
+          </w:tcPr>
+          <w:p/>
+        </w:tc>
+      </w:tr>
+      <w:tr>
+        <w:tc>
+          <w:tcPr>
+            <w:tcW w:w="2547" w:type="dxa"/>
+          </w:tcPr>
+          <w:p>
+            <w:r>
+              <w:t>W2151939_</w:t>
+            </w:r>
+            <w:r>
+              <w:t>Facility</w:t>
+            </w:r>
+          </w:p>
+        </w:tc>
+        <w:tc>
+          <w:tcPr>
+            <w:tcW w:w="6469" w:type="dxa"/>
+          </w:tcPr>
+          <w:p/>
+        </w:tc>
+      </w:tr>
+      <w:tr>
+        <w:tc>
+          <w:tcPr>
+            <w:tcW w:w="2547" w:type="dxa"/>
+          </w:tcPr>
+          <w:p>
+            <w:r>
+              <w:t>W2151939_</w:t>
+            </w:r>
+            <w:r>
+              <w:t>Apartment</w:t>
+            </w:r>
+          </w:p>
+        </w:tc>
+        <w:tc>
+          <w:tcPr>
+            <w:tcW w:w="6469" w:type="dxa"/>
+          </w:tcPr>
+          <w:p/>
+        </w:tc>
+      </w:tr>
+      <w:tr>
+        <w:tc>
+          <w:tcPr>
+            <w:tcW w:w="2547" w:type="dxa"/>
+          </w:tcPr>
+          <w:p>
+            <w:r>
+              <w:t>W2151939_</w:t>
+            </w:r>
+            <w:r>
+              <w:t>Parking_Lot</w:t>
+            </w:r>
+          </w:p>
+        </w:tc>
+        <w:tc>
+          <w:tcPr>
+            <w:tcW w:w="6469" w:type="dxa"/>
+          </w:tcPr>
+          <w:p/>
+        </w:tc>
+      </w:tr>
+      <w:tr>
+        <w:tc>
+          <w:tcPr>
+            <w:tcW w:w="2547" w:type="dxa"/>
+          </w:tcPr>
+          <w:p>
+            <w:r>
+              <w:t>W2151939_</w:t>
+            </w:r>
+            <w:r>
+              <w:t>Resident_Lot</w:t>
+            </w:r>
+          </w:p>
+        </w:tc>
+        <w:tc>
+          <w:tcPr>
+            <w:tcW w:w="6469" w:type="dxa"/>
+          </w:tcPr>
+          <w:p/>
+        </w:tc>
+      </w:tr>
+      <w:tr>
+        <w:tc>
+          <w:tcPr>
+            <w:tcW w:w="2547" w:type="dxa"/>
+          </w:tcPr>
+          <w:p>
+            <w:r>
+              <w:t>W2151939_</w:t>
+            </w:r>
+            <w:r>
+              <w:t>Visitor_Lot</w:t>
+            </w:r>
+          </w:p>
+        </w:tc>
+        <w:tc>
+          <w:tcPr>
+            <w:tcW w:w="6469" w:type="dxa"/>
+          </w:tcPr>
+          <w:p/>
+        </w:tc>
+      </w:tr>
+      <w:tr>
+        <w:tc>
+          <w:tcPr>
+            <w:tcW w:w="2547" w:type="dxa"/>
+          </w:tcPr>
+          <w:p>
+            <w:r>
+              <w:lastRenderedPageBreak/>
+              <w:t>W2151939_</w:t>
+            </w:r>
+            <w:r>
+              <w:t>Parking_Space</w:t>
+            </w:r>
+          </w:p>
+        </w:tc>
+        <w:tc>
+          <w:tcPr>
+            <w:tcW w:w="6469" w:type="dxa"/>
+          </w:tcPr>
+          <w:p/>
+        </w:tc>
+      </w:tr>
+      <w:tr>
+        <w:tc>
+          <w:tcPr>
+            <w:tcW w:w="2547" w:type="dxa"/>
+          </w:tcPr>
+          <w:p>
+            <w:r>
+              <w:t>W2151939_</w:t>
+            </w:r>
+            <w:r>
+              <w:t>Resident_Space</w:t>
+            </w:r>
+          </w:p>
+        </w:tc>
+        <w:tc>
+          <w:tcPr>
+            <w:tcW w:w="6469" w:type="dxa"/>
+          </w:tcPr>
+          <w:p/>
+        </w:tc>
+      </w:tr>
+      <w:tr>
+        <w:tc>
+          <w:tcPr>
+            <w:tcW w:w="2547" w:type="dxa"/>
+          </w:tcPr>
+          <w:p>
+            <w:r>
+              <w:t>W2151939_</w:t>
+            </w:r>
+            <w:r>
+              <w:t>Standard_Space</w:t>
+            </w:r>
+          </w:p>
+        </w:tc>
+        <w:tc>
+          <w:tcPr>
+            <w:tcW w:w="6469" w:type="dxa"/>
+          </w:tcPr>
+          <w:p/>
+        </w:tc>
+      </w:tr>
+      <w:tr>
+        <w:tc>
+          <w:tcPr>
+            <w:tcW w:w="2547" w:type="dxa"/>
+          </w:tcPr>
+          <w:p>
+            <w:r>
+              <w:t>W2151939_</w:t>
+            </w:r>
+            <w:r>
+              <w:t xml:space="preserve">Chargin_Space </w:t>
+            </w:r>
+          </w:p>
+        </w:tc>
+        <w:tc>
+          <w:tcPr>
+            <w:tcW w:w="6469" w:type="dxa"/>
+          </w:tcPr>
+          <w:p/>
+        </w:tc>
+      </w:tr>
+      <w:tr>
+        <w:tc>
+          <w:tcPr>
+            <w:tcW w:w="2547" w:type="dxa"/>
+          </w:tcPr>
+          <w:p>
+            <w:r>
+              <w:t>W2151939_</w:t>
+            </w:r>
+          </w:p>
+        </w:tc>
+        <w:tc>
+          <w:tcPr>
+            <w:tcW w:w="6469" w:type="dxa"/>
+          </w:tcPr>
+          <w:p/>
+        </w:tc>
+      </w:tr>
+    </w:tbl>
+    <w:p/>
     <w:p/>
     <w:p/>
     <w:p/>

</xml_diff>